<commit_message>
补充缺失文献 Ke et al. 2023 (Continual Pre-training of Language Models, ICLR 2023) 并规范在文引用
</commit_message>
<xml_diff>
--- a/第一节生成式大模型与下一代AI技术在中医药中的适配前景0611.docx
+++ b/第一节生成式大模型与下一代AI技术在中医药中的适配前景0611.docx
@@ -242,7 +242,7 @@
         <w:rPr>
           <w:rFonts w:hint="eastAsia"/>
         </w:rPr>
-        <w:t>未来的关键不在于增加语料规模,而在于三个尚未解决的问题。其一,灾难性遗忘(catastrophic forgetting)与知识叠加之间的平衡:中医语料注入越深,模型的通用推理能力越可能受到侵蚀,如何在习得中医知识的同时保持通用能力,是持续学习(continual learning)需要回答的开放问题 [Ke Z, et al.,2023]。其二,古籍语料中高密度知识的有效内化:古籍语义复杂、流派各异,简单的下一词预测难以捕捉其中的辨证逻辑;面向古籍命名实体识别的研究显示,经领域预训练与微调的 7B 模型可显著优于通用模型(F1 约 0.93),表明古籍需要专门的语料工程与适配策略,而非通用方案 [Zheng et al., 2025]。其三,语料质量与代表性的治理:多数模型仍依赖文本挖掘结合人工校验自建语料 [Dai et al., 2024],未来需建立语料、术语与证据等级三位一体的中医知识基座,使继续预训练立足于可治理、可追溯的数据之上。可以预见,下一阶段的竞争焦点将由模型规模转向知识基座的质量:能否构建高质量、标准化、流派可辨的中医知识语料,将在很大程度上决定垂直大模型的上游优势。</w:t>
+        <w:t>未来的关键不在于增加语料规模,而在于三个尚未解决的问题。其一,灾难性遗忘(catastrophic forgetting)与知识叠加之间的平衡:中医语料注入越深,模型的通用推理能力越可能受到侵蚀,如何在习得中医知识的同时保持通用能力,是持续学习(continual learning)需要回答的开放问题 [Ke et al., 2023]。其二,古籍语料中高密度知识的有效内化:古籍语义复杂、流派各异,简单的下一词预测难以捕捉其中的辨证逻辑;面向古籍命名实体识别的研究显示,经领域预训练与微调的 7B 模型可显著优于通用模型(F1 约 0.93),表明古籍需要专门的语料工程与适配策略,而非通用方案 [Zheng et al., 2025]。其三,语料质量与代表性的治理:多数模型仍依赖文本挖掘结合人工校验自建语料 [Dai et al., 2024],未来需建立语料、术语与证据等级三位一体的中医知识基座,使继续预训练立足于可治理、可追溯的数据之上。可以预见,下一阶段的竞争焦点将由模型规模转向知识基座的质量:能否构建高质量、标准化、流派可辨的中医知识语料,将在很大程度上决定垂直大模型的上游优势。</w:t>
       </w:r>
     </w:p>
     <w:p>
@@ -4501,6 +4501,31 @@
       </w:pPr>
       <w:r>
         <w:t>Chen S, Li X, Zhang M, et al. CARES: Comprehensive Evaluation of Safety and Adversarial Robustness in Medical LLMs. 2025. arXiv:2505.11413</w:t>
+      </w:r>
+    </w:p>
+    <w:p>
+      <w:pPr>
+        <w:pageBreakBefore w:val="0"/>
+        <w:widowControl w:val="0"/>
+        <w:numPr>
+          <w:ilvl w:val="0"/>
+          <w:numId w:val="1"/>
+        </w:numPr>
+        <w:kinsoku/>
+        <w:wordWrap/>
+        <w:overflowPunct/>
+        <w:topLinePunct w:val="0"/>
+        <w:autoSpaceDE/>
+        <w:autoSpaceDN/>
+        <w:bidi w:val="0"/>
+        <w:adjustRightInd/>
+        <w:snapToGrid/>
+        <w:spacing w:beforeAutospacing="0" w:afterAutospacing="0"/>
+        <w:ind w:left="425" w:leftChars="0" w:hanging="425" w:firstLineChars="0"/>
+        <w:textAlignment w:val="auto"/>
+      </w:pPr>
+      <w:r>
+        <w:t>Ke Z, Shao Y, Lin H, et al. Continual Pre-training of Language Models. ICLR 2023. arXiv:2302.03241</w:t>
       </w:r>
     </w:p>
     <w:sectPr>

</xml_diff>